<commit_message>
Add proper shebang and company name to contact details
</commit_message>
<xml_diff>
--- a/Karsten Opdal - CV.docx
+++ b/Karsten Opdal - CV.docx
@@ -96,6 +96,23 @@
               <w:rPr>
                 <w:sz w:val="20"/>
               </w:rPr>
+            </w:r>
+            <w:r>
+              <w:br/>
+            </w:r>
+            <w:r>
+              <w:rPr>
+                <w:b/>
+                <w:color w:val="666666"/>
+                <w:sz w:val="18"/>
+              </w:rPr>
+              <w:t xml:space="preserve">Company: </w:t>
+            </w:r>
+            <w:r>
+              <w:rPr>
+                <w:sz w:val="20"/>
+              </w:rPr>
+              <w:t>Opdal Enterprise</w:t>
             </w:r>
             <w:r>
               <w:br/>

</xml_diff>

<commit_message>
Consolidate GitHub contact lines into single profile link
</commit_message>
<xml_diff>
--- a/Karsten Opdal - CV.docx
+++ b/Karsten Opdal - CV.docx
@@ -208,30 +208,13 @@
                 <w:color w:val="666666"/>
                 <w:sz w:val="18"/>
               </w:rPr>
-              <w:t xml:space="preserve">GitHub: </w:t>
-            </w:r>
-            <w:r>
-              <w:rPr>
-                <w:sz w:val="20"/>
-              </w:rPr>
-              <w:t>paletteguy</w:t>
-            </w:r>
-            <w:r>
-              <w:br/>
-            </w:r>
-            <w:r>
-              <w:rPr>
-                <w:b/>
-                <w:color w:val="666666"/>
-                <w:sz w:val="18"/>
-              </w:rPr>
               <w:t xml:space="preserve">GitHub profile: </w:t>
             </w:r>
             <w:r>
               <w:rPr>
                 <w:sz w:val="20"/>
               </w:rPr>
-              <w:t>https://github.com/paletteguy/profile</w:t>
+              <w:t>https://github.com/paletteguy</w:t>
             </w:r>
           </w:p>
         </w:tc>

</xml_diff>

<commit_message>
Refactor CV generator to produce .docx, .pdf, and README.md from single data source
Extract all CV content into a shared CV_DATA dictionary, eliminating
duplication between generate_cv.py and README.md. Add Languages section
(Danish, English, Norwegian, Swedish, German), CVR number to contact
details, and PDF generation via LibreOffice.
</commit_message>
<xml_diff>
--- a/Karsten Opdal - CV.docx
+++ b/Karsten Opdal - CV.docx
@@ -113,6 +113,23 @@
                 <w:sz w:val="20"/>
               </w:rPr>
               <w:t>Opdal Enterprise</w:t>
+            </w:r>
+            <w:r>
+              <w:br/>
+            </w:r>
+            <w:r>
+              <w:rPr>
+                <w:b/>
+                <w:color w:val="666666"/>
+                <w:sz w:val="18"/>
+              </w:rPr>
+              <w:t xml:space="preserve">CVR: </w:t>
+            </w:r>
+            <w:r>
+              <w:rPr>
+                <w:sz w:val="20"/>
+              </w:rPr>
+              <w:t>31357667</w:t>
             </w:r>
             <w:r>
               <w:br/>
@@ -326,6 +343,92 @@
         <w:rPr>
           <w:color w:val="2E4A62"/>
         </w:rPr>
+        <w:t>Languages</w:t>
+      </w:r>
+    </w:p>
+    <w:p>
+      <w:pPr>
+        <w:spacing w:after="40"/>
+      </w:pPr>
+      <w:r>
+        <w:rPr>
+          <w:b/>
+        </w:rPr>
+        <w:t xml:space="preserve">Danish: </w:t>
+      </w:r>
+      <w:r>
+        <w:t>Native speaker (written and spoken)</w:t>
+      </w:r>
+    </w:p>
+    <w:p>
+      <w:pPr>
+        <w:spacing w:after="40"/>
+      </w:pPr>
+      <w:r>
+        <w:rPr>
+          <w:b/>
+        </w:rPr>
+        <w:t xml:space="preserve">English: </w:t>
+      </w:r>
+      <w:r>
+        <w:t>Fluent — second language used throughout career, full professional proficiency</w:t>
+      </w:r>
+    </w:p>
+    <w:p>
+      <w:pPr>
+        <w:spacing w:after="40"/>
+      </w:pPr>
+      <w:r>
+        <w:rPr>
+          <w:b/>
+        </w:rPr>
+        <w:t xml:space="preserve">Norwegian: </w:t>
+      </w:r>
+      <w:r>
+        <w:t>Fluent understanding (spoken and written), conversational speaking — 25 years' exposure, Norwegian spouse</w:t>
+      </w:r>
+    </w:p>
+    <w:p>
+      <w:pPr>
+        <w:spacing w:after="40"/>
+      </w:pPr>
+      <w:r>
+        <w:rPr>
+          <w:b/>
+        </w:rPr>
+        <w:t xml:space="preserve">Swedish: </w:t>
+      </w:r>
+      <w:r>
+        <w:t>Strong understanding (spoken and written), near-conversational speaking — 30 years' exposure, neighbouring country</w:t>
+      </w:r>
+    </w:p>
+    <w:p>
+      <w:pPr>
+        <w:spacing w:after="40"/>
+      </w:pPr>
+      <w:r>
+        <w:rPr>
+          <w:b/>
+        </w:rPr>
+        <w:t xml:space="preserve">German: </w:t>
+      </w:r>
+      <w:r>
+        <w:t>Good understanding (spoken and written), speaking somewhat rusty — 10 years during education</w:t>
+      </w:r>
+    </w:p>
+    <w:p>
+      <w:r>
+        <w:br w:type="page"/>
+      </w:r>
+    </w:p>
+    <w:p>
+      <w:pPr>
+        <w:pStyle w:val="Heading1"/>
+      </w:pPr>
+      <w:r>
+        <w:rPr>
+          <w:color w:val="2E4A62"/>
+        </w:rPr>
         <w:t>Experience</w:t>
       </w:r>
     </w:p>
@@ -416,7 +519,7 @@
         <w:spacing w:after="40"/>
       </w:pPr>
       <w:r>
-        <w:t>Created SimServer Imager (Qt6/C++/QML) for managed WIC/VSI/SPU deployment and CDN distribution. Built VEX Kernel Checker — AI-assisted CVE analysis integrated with Dependency-Track. Built cross-platform SimServer companion app.</w:t>
+        <w:t>Created SimServer Imager (Qt6/C++/QML) for managed WIC/VSI/SPU deployment and CDN distribution. Built VEX Kernel Checker — AI-assisted CVE analysis integrated with Dependency-Track.</w:t>
       </w:r>
     </w:p>
     <w:p>
@@ -443,7 +546,7 @@
         <w:spacing w:after="40"/>
       </w:pPr>
       <w:r>
-        <w:t>Built SimServer Companion — AI-powered diagnostic platform using Claude/Gemini/OpenAI for crash analysis across SimPad, LinkBox, and CAN firmware. Jira automation, source context integration. Delivered as CLI, VS Code extension, and Tauri desktop app.</w:t>
+        <w:t>Built Jira Analyse Companion — AI-powered diagnostic platform using Claude/Gemini/OpenAI for crash analysis across SimPad, LinkBox, and CAN firmware. Jira automation, source context integration. Delivered as CLI, VS Code extension, and Tauri desktop app.</w:t>
       </w:r>
     </w:p>
     <w:p>
@@ -1426,6 +1529,10 @@
       </w:r>
       <w:r>
         <w:br/>
+        <w:t>High school diploma</w:t>
+      </w:r>
+      <w:r>
+        <w:br/>
         <w:t>1976 – 1987</w:t>
       </w:r>
     </w:p>

</xml_diff>

<commit_message>
Extract CV data to JSON and auto-calculate experience durations
- Move CV content from inline Python dict to cv_data.json (single source of truth)
- Add format_period() to calculate durations from start/end dates
- Refactor generate_md() to reduce repetitive code
- Improve markdown formatting: compact languages, education with subheadings
- Replace me.png with me.jpeg, add me-skies.jpeg
</commit_message>
<xml_diff>
--- a/Karsten Opdal - CV.docx
+++ b/Karsten Opdal - CV.docx
@@ -40,6 +40,12 @@
         <w:jc w:val="left"/>
         <w:tblLook w:firstColumn="1" w:firstRow="1" w:lastColumn="0" w:lastRow="0" w:noHBand="0" w:noVBand="1" w:val="04A0"/>
         <w:tblLayout w:type="fixed"/>
+        <w:tblCellMar>
+          <w:top w:w="0" w:type="dxa"/>
+          <w:left w:w="0" w:type="dxa"/>
+          <w:bottom w:w="0" w:type="dxa"/>
+          <w:right w:w="0" w:type="dxa"/>
+        </w:tblCellMar>
         <w:tblBorders>
           <w:top w:val="none" w:sz="0" w:space="0" w:color="auto"/>
           <w:left w:val="none" w:sz="0" w:space="0" w:color="auto"/>
@@ -50,13 +56,13 @@
         </w:tblBorders>
       </w:tblPr>
       <w:tblGrid>
-        <w:gridCol w:w="7343"/>
-        <w:gridCol w:w="2015"/>
+        <w:gridCol w:w="7056"/>
+        <w:gridCol w:w="2304"/>
       </w:tblGrid>
       <w:tr>
         <w:tc>
           <w:tcPr>
-            <w:tcW w:type="dxa" w:w="7343"/>
+            <w:tcW w:type="dxa" w:w="7056"/>
             <w:tcBorders>
               <w:top w:val="none" w:sz="0" w:space="0" w:color="auto"/>
               <w:left w:val="none" w:sz="0" w:space="0" w:color="auto"/>
@@ -237,7 +243,7 @@
         </w:tc>
         <w:tc>
           <w:tcPr>
-            <w:tcW w:type="dxa" w:w="2015"/>
+            <w:tcW w:type="dxa" w:w="2304"/>
             <w:tcBorders>
               <w:top w:val="none" w:sz="0" w:space="0" w:color="auto"/>
               <w:left w:val="none" w:sz="0" w:space="0" w:color="auto"/>
@@ -248,12 +254,12 @@
           <w:p>
             <w:pPr>
               <w:spacing w:before="0" w:after="0"/>
-              <w:jc w:val="right"/>
+              <w:jc w:val="center"/>
             </w:pPr>
             <w:r>
               <w:drawing>
                 <wp:inline xmlns:a="http://schemas.openxmlformats.org/drawingml/2006/main" xmlns:pic="http://schemas.openxmlformats.org/drawingml/2006/picture">
-                  <wp:extent cx="1280160" cy="1291228"/>
+                  <wp:extent cx="1371600" cy="1747471"/>
                   <wp:docPr id="1" name="Picture 1"/>
                   <wp:cNvGraphicFramePr>
                     <a:graphicFrameLocks noChangeAspect="1"/>
@@ -262,7 +268,7 @@
                     <a:graphicData uri="http://schemas.openxmlformats.org/drawingml/2006/picture">
                       <pic:pic>
                         <pic:nvPicPr>
-                          <pic:cNvPr id="0" name="image.png"/>
+                          <pic:cNvPr id="0" name="me.jpeg"/>
                           <pic:cNvPicPr/>
                         </pic:nvPicPr>
                         <pic:blipFill>
@@ -274,7 +280,7 @@
                         <pic:spPr>
                           <a:xfrm>
                             <a:off x="0" y="0"/>
-                            <a:ext cx="1280160" cy="1291228"/>
+                            <a:ext cx="1371600" cy="1747471"/>
                           </a:xfrm>
                           <a:prstGeom prst="rect"/>
                         </pic:spPr>
@@ -332,7 +338,7 @@
     </w:p>
     <w:p>
       <w:r>
-        <w:t>C++ (C++23) · Embedded Linux · Yocto · Linux kernel · Qt/QML (Qt 3–6) · Python · WiFi/Bluetooth · CI/CD · Boost · AI-assisted engineering</w:t>
+        <w:t>C++ (C++23) · Embedded Linux · Yocto · Linux kernel · Qt/QML (Qt 3–6) · Python · Rust · WiFi/Bluetooth · CI/CD · Boost · AI-assisted engineering</w:t>
       </w:r>
     </w:p>
     <w:p>
@@ -920,7 +926,7 @@
           <w:color w:val="666666"/>
           <w:sz w:val="18"/>
         </w:rPr>
-        <w:t>October 2000 – February 2007 (6 years 5 months)</w:t>
+        <w:t>September 2000 – February 2007 (6 years 6 months)</w:t>
       </w:r>
     </w:p>
     <w:p>
@@ -1020,7 +1026,7 @@
           <w:color w:val="666666"/>
           <w:sz w:val="18"/>
         </w:rPr>
-        <w:t>April 2000 – June 2000 (3 months)</w:t>
+        <w:t>March 2000 – August 2000 (6 months)</w:t>
       </w:r>
     </w:p>
     <w:p>
@@ -1061,7 +1067,7 @@
           <w:color w:val="666666"/>
           <w:sz w:val="18"/>
         </w:rPr>
-        <w:t>May 2000 – October 2000 (6 months)</w:t>
+        <w:t>March 2000 – September 2000 (7 months)</w:t>
       </w:r>
     </w:p>
     <w:p>
@@ -1107,7 +1113,7 @@
           <w:color w:val="666666"/>
           <w:sz w:val="18"/>
         </w:rPr>
-        <w:t>May 1999 – March 2000 (11 months)</w:t>
+        <w:t>May 1999 – February 2000 (10 months)</w:t>
       </w:r>
     </w:p>
     <w:p>
@@ -1166,7 +1172,7 @@
           <w:color w:val="666666"/>
           <w:sz w:val="18"/>
         </w:rPr>
-        <w:t>May 1999 – March 2000 (11 months)</w:t>
+        <w:t>May 1999 – February 2000 (10 months)</w:t>
       </w:r>
     </w:p>
     <w:p>

</xml_diff>

<commit_message>
Add military service and Hjemmeværnet, update dates and skills
- Add Military Service (1992) and Hjemmeværnet (2002–Present) entries
- Correct dates for Vizion Factory, Greve Kommune, and Niels Brock CS
- Add Rust to core skills
</commit_message>
<xml_diff>
--- a/Karsten Opdal - CV.docx
+++ b/Karsten Opdal - CV.docx
@@ -1213,7 +1213,7 @@
           <w:color w:val="666666"/>
           <w:sz w:val="18"/>
         </w:rPr>
-        <w:t>October 1995 – April 1999 (3 years 7 months)</w:t>
+        <w:t>December 1996 – April 1999 (2 years 5 months)</w:t>
       </w:r>
     </w:p>
     <w:p>
@@ -1263,7 +1263,7 @@
           <w:color w:val="666666"/>
           <w:sz w:val="18"/>
         </w:rPr>
-        <w:t>January 1991 – October 1995 (4 years 10 months)</w:t>
+        <w:t>January 1993 – October 1996 (3 years 10 months)</w:t>
       </w:r>
     </w:p>
     <w:p>
@@ -1302,6 +1302,47 @@
       <w:r>
         <w:br w:type="page"/>
       </w:r>
+    </w:p>
+    <w:p>
+      <w:r>
+        <w:rPr>
+          <w:b/>
+          <w:sz w:val="24"/>
+        </w:rPr>
+        <w:t>Military Service</w:t>
+      </w:r>
+    </w:p>
+    <w:p>
+      <w:r>
+        <w:rPr>
+          <w:i/>
+          <w:sz w:val="21"/>
+        </w:rPr>
+        <w:t>Recruit</w:t>
+      </w:r>
+    </w:p>
+    <w:p>
+      <w:r>
+        <w:rPr>
+          <w:color w:val="666666"/>
+          <w:sz w:val="18"/>
+        </w:rPr>
+        <w:t>February 1992 – October 1992 (9 months)</w:t>
+      </w:r>
+    </w:p>
+    <w:p>
+      <w:pPr>
+        <w:pStyle w:val="ListBullet"/>
+        <w:spacing w:after="40"/>
+      </w:pPr>
+      <w:r>
+        <w:t>Danish Army, HAWK‑eskadrille at Stevnsfortet, Zealand</w:t>
+      </w:r>
+    </w:p>
+    <w:p>
+      <w:pPr>
+        <w:spacing w:before="80"/>
+      </w:pPr>
     </w:p>
     <w:p>
       <w:r>
@@ -1405,6 +1446,56 @@
     </w:p>
     <w:p>
       <w:r>
+        <w:rPr>
+          <w:b/>
+          <w:sz w:val="24"/>
+        </w:rPr>
+        <w:t>Hjemmeværnet</w:t>
+      </w:r>
+    </w:p>
+    <w:p>
+      <w:r>
+        <w:rPr>
+          <w:i/>
+          <w:sz w:val="21"/>
+        </w:rPr>
+        <w:t>Volunteer</w:t>
+      </w:r>
+    </w:p>
+    <w:p>
+      <w:r>
+        <w:rPr>
+          <w:color w:val="666666"/>
+          <w:sz w:val="18"/>
+        </w:rPr>
+        <w:t>April 2002 – Present (24 years)</w:t>
+      </w:r>
+    </w:p>
+    <w:p>
+      <w:pPr>
+        <w:pStyle w:val="ListBullet"/>
+        <w:spacing w:after="40"/>
+      </w:pPr>
+      <w:r>
+        <w:t>Danish Home Guard, Hjemmeværnet, Køge, Zealand</w:t>
+      </w:r>
+    </w:p>
+    <w:p>
+      <w:pPr>
+        <w:pStyle w:val="ListBullet"/>
+        <w:spacing w:after="40"/>
+      </w:pPr>
+      <w:r>
+        <w:t>Trained in basic military skills and regularly participate in exercises and operations to support national defense and civil authorities.</w:t>
+      </w:r>
+    </w:p>
+    <w:p>
+      <w:pPr>
+        <w:spacing w:before="80"/>
+      </w:pPr>
+    </w:p>
+    <w:p>
+      <w:r>
         <w:br w:type="page"/>
       </w:r>
     </w:p>
@@ -1491,7 +1582,7 @@
       </w:r>
       <w:r>
         <w:br/>
-        <w:t>September 1990 – June 1992</w:t>
+        <w:t>August 1990 – January 1992</w:t>
       </w:r>
     </w:p>
     <w:p>
@@ -1523,7 +1614,7 @@
       </w:r>
       <w:r>
         <w:br/>
-        <w:t>August 1987 – June 1988</w:t>
+        <w:t>August 1987 – Juni 1988</w:t>
       </w:r>
     </w:p>
     <w:p>

</xml_diff>

<commit_message>
Expand CV with per-experience skills, new bullets, and sub-bullet support
- Shorten summary to concise 3rd person format
- Add per-experience skills arrays to all job entries
- Update generator to render skills in both docx and markdown
- Add sub-bullet support (dict format) for nested items
- Add missing experience bullets: RED compliance, SimPad UI, LLEAP/C#,
  WiFi, music player DB, web browser, screensavers, macros, Office
  transition, network evolution, database system, CorelDRAW
- Expand core skills with C, Azure, GitHub Actions, Secure boot, FastAPI, Tauri
- Add Nokia SMS expertise, S30 memory management, SQLite/TDD
- Update Telenor bullet and skills
</commit_message>
<xml_diff>
--- a/Karsten Opdal - CV.docx
+++ b/Karsten Opdal - CV.docx
@@ -307,19 +307,13 @@
     </w:p>
     <w:p>
       <w:r>
-        <w:t>I make embedded Linux do what it's told — on hardware where failure isn't an option.</w:t>
+        <w:t>An embedded Linux specialist who makes hardware do what it's told — where failure isn't an option.</w:t>
         <w:br/>
         <w:br/>
-        <w:t>For 15 years at Laerdal Medical, I was the architect behind SimPad's embedded platform — owning everything from the Yocto build system delivering production Linux across ARM and x86, to the real-time simulation engine that brings medical manikins to life via CAN bus, IOC controllers, and physiological modelling. I evolved the build system through six major Yocto releases (Rocko to Scarthgap), migrated the platform from Ubuntu to a custom distribution with RAUC A/B OTA updates and HSM-signed security, and architected CI/CD pipelines with SBOM generation and CVE tracking for medical device compliance. Along the way I built Qt/QML touch-screen UIs, ALSA audio pipelines, WiFi/Bluetooth integration (with patches contributed to BlueZ and Qt Bluetooth), and a suite of internal tools — from an AI-powered diagnostic platform to an SSH certificate portal and a cross-platform device imager.</w:t>
+        <w:t>30+ years spanning Nokia handsets, Infineon baseband platforms, and medical simulation devices. He owns the full stack from silicon to screen: Yocto build systems, kernel bring-up, real-time C++ services, CI/CD pipelines, and secure OTA deployment. AI is deeply integrated into his engineering workflow.</w:t>
         <w:br/>
         <w:br/>
-        <w:t>Before Laerdal, I spent a decade in the Nokia ecosystem — developing the user interfaces for the iconic 3210 and 3310, implementing concatenated SMS and T9 input, and building simulation tools that let engineers develop phone software in Visual Studio without touching hardware. I debugged firmware issues nobody else could crack, including a battery drain bug that improved battery lifetime by 30%. At Infineon, I shipped the Nokia 2110 low-cost platform where every kilobyte counted.</w:t>
-        <w:br/>
-        <w:br/>
-        <w:t>I own the full stack from silicon to screen: board bring-up on i.MX6, i.MX8, and x86, Linux kernel debugging and Device Tree customization, C++ services in real-time, and secure OTA deployment. I've integrated AI deeply into my engineering workflow — from AI-assisted code generation and review to building custom tooling around LLMs for debugging and documentation.</w:t>
-        <w:br/>
-        <w:br/>
-        <w:t>30+ years from Nokia handsets to medical devices. Now looking for the next platform worth building.</w:t>
+        <w:t>Now looking for the next platform worth building.</w:t>
         <w:br/>
         <w:br/>
         <w:t>Copenhagen, Denmark | Open to remote across Europe</w:t>
@@ -338,7 +332,7 @@
     </w:p>
     <w:p>
       <w:r>
-        <w:t>C++ (C++23) · Embedded Linux · Yocto · Linux kernel · Qt/QML (Qt 3–6) · Python · Rust · WiFi/Bluetooth · CI/CD · Boost · AI-assisted engineering</w:t>
+        <w:t>C · C++ (C++23) · Embedded Linux · Yocto · Linux kernel · Qt/QML (Qt 3–6) · Python · Rust · WiFi/Bluetooth · CI/CD · GitHub Actions · Boost · Azure · Secure boot · FastAPI · Tauri · AI-assisted engineering</w:t>
       </w:r>
     </w:p>
     <w:p>
@@ -507,7 +501,7 @@
         <w:spacing w:after="40"/>
       </w:pPr>
       <w:r>
-        <w:t>Developed real-time simulation engine controlling medical manikins (SimMom, SimBaby, MammaAnne, SimMan ALS) via CAN bus or IOC controller and physiological modelling. C++ (up to C++23) with Boost, Qt 3–6 with deep QML expertise for embedded UIs. Proficient in C#.</w:t>
+        <w:t>Developed real-time simulation engine controlling medical manikins (SimMom, SimBaby, MammaAnne, SimMan ALS) via CAN bus or IOC controller and physiological modelling. C++ (up to C++23) with Boost.</w:t>
       </w:r>
     </w:p>
     <w:p>
@@ -516,7 +510,7 @@
         <w:spacing w:after="40"/>
       </w:pPr>
       <w:r>
-        <w:t>ALSA audio pipelines for clinical simulation. Bluetooth expert with patches to BlueZ and Qt Bluetooth stacks.</w:t>
+        <w:t>Designed and developed SimPad touch-screen UI using Qt 4–5 with QML for embedded interfaces.</w:t>
       </w:r>
     </w:p>
     <w:p>
@@ -525,7 +519,43 @@
         <w:spacing w:after="40"/>
       </w:pPr>
       <w:r>
-        <w:t>Created SimServer Imager (Qt6/C++/QML) for managed WIC/VSI/SPU deployment and CDN distribution. Built VEX Kernel Checker — AI-assisted CVE analysis integrated with Dependency-Track.</w:t>
+        <w:t>Proficient in C#, used for LLEAP development.</w:t>
+      </w:r>
+    </w:p>
+    <w:p>
+      <w:pPr>
+        <w:pStyle w:val="ListBullet"/>
+        <w:spacing w:after="40"/>
+      </w:pPr>
+      <w:r>
+        <w:t>WiFi connectivity and ALSA audio pipelines for clinical simulation. Bluetooth expert with patches contributed to BlueZ and Qt Bluetooth stacks.</w:t>
+      </w:r>
+    </w:p>
+    <w:p>
+      <w:pPr>
+        <w:pStyle w:val="ListBullet"/>
+        <w:spacing w:after="40"/>
+      </w:pPr>
+      <w:r>
+        <w:t>Applied EU Radio Equipment Directive (RED) compliance — hardened Linux kernel configuration, implemented secure boot, and built a CVE checker tool that analyzed whether kernel config options introduced known vulnerabilities or whether existing patches already addressed them.</w:t>
+      </w:r>
+    </w:p>
+    <w:p>
+      <w:pPr>
+        <w:pStyle w:val="ListBullet"/>
+        <w:spacing w:after="40"/>
+      </w:pPr>
+      <w:r>
+        <w:t>Created SimServer Imager (Qt6/C++/QML, based on Raspberry Pi Imager) for managed WIC/VSI/SPU deployment and CDN distribution.</w:t>
+      </w:r>
+    </w:p>
+    <w:p>
+      <w:pPr>
+        <w:pStyle w:val="ListBullet"/>
+        <w:spacing w:after="40"/>
+      </w:pPr>
+      <w:r>
+        <w:t>Built VEX Kernel Checker — AI-assisted Kernel CVE analysis integrated with Dependency-Track.</w:t>
       </w:r>
     </w:p>
     <w:p>
@@ -553,6 +583,26 @@
       </w:pPr>
       <w:r>
         <w:t>Built Jira Analyse Companion — AI-powered diagnostic platform using Claude/Gemini/OpenAI for crash analysis across SimPad, LinkBox, and CAN firmware. Jira automation, source context integration. Delivered as CLI, VS Code extension, and Tauri desktop app.</w:t>
+      </w:r>
+    </w:p>
+    <w:p>
+      <w:pPr>
+        <w:spacing w:before="40" w:after="0"/>
+      </w:pPr>
+      <w:r>
+        <w:rPr>
+          <w:b/>
+          <w:color w:val="666666"/>
+          <w:sz w:val="18"/>
+        </w:rPr>
+        <w:t xml:space="preserve">Skills: </w:t>
+      </w:r>
+      <w:r>
+        <w:rPr>
+          <w:color w:val="666666"/>
+          <w:sz w:val="18"/>
+        </w:rPr>
+        <w:t>C++ · C++23 · Boost · C# · Rust · Python · Bash · JavaScript · TypeScript · Yocto · Linux kernel · Device Tree (DTB) · ARM (i.MX6/i.MX8) · x86 · Qt 4 · Qt 5 · Qt 6 · QML · FastAPI · RAUC · Azure · GitHub Actions · CAN bus · ALSA · WiFi · Bluetooth · BlueZ · Tauri · Secure boot · RED · Security · GDPR · FIPS 140 · NIST SP 800-171 · Unit testing · TDD · OOD · System architecture · Software architecture · WCF · XAML · MAUI</w:t>
       </w:r>
     </w:p>
     <w:p>
@@ -671,6 +721,26 @@
     </w:p>
     <w:p>
       <w:pPr>
+        <w:spacing w:before="40" w:after="0"/>
+      </w:pPr>
+      <w:r>
+        <w:rPr>
+          <w:b/>
+          <w:color w:val="666666"/>
+          <w:sz w:val="18"/>
+        </w:rPr>
+        <w:t xml:space="preserve">Skills: </w:t>
+      </w:r>
+      <w:r>
+        <w:rPr>
+          <w:color w:val="666666"/>
+          <w:sz w:val="18"/>
+        </w:rPr>
+        <w:t>C · C++ · Linux · BSD · Unix · Embedded firmware · Debugging · Lithium battery management · Teaching · Developer support</w:t>
+      </w:r>
+    </w:p>
+    <w:p>
+      <w:pPr>
         <w:spacing w:before="80"/>
       </w:pPr>
     </w:p>
@@ -726,6 +796,26 @@
       </w:pPr>
       <w:r>
         <w:t>Collaborated with cross-functional teams to ensure timely resolution of software defects, improving user experience.</w:t>
+      </w:r>
+    </w:p>
+    <w:p>
+      <w:pPr>
+        <w:spacing w:before="40" w:after="0"/>
+      </w:pPr>
+      <w:r>
+        <w:rPr>
+          <w:b/>
+          <w:color w:val="666666"/>
+          <w:sz w:val="18"/>
+        </w:rPr>
+        <w:t xml:space="preserve">Skills: </w:t>
+      </w:r>
+      <w:r>
+        <w:rPr>
+          <w:color w:val="666666"/>
+          <w:sz w:val="18"/>
+        </w:rPr>
+        <w:t>C · C++ · S40 platform · Firmware debugging · Visual Studio plugin · BSD · Linux · Unix · Bash</w:t>
       </w:r>
     </w:p>
     <w:p>
@@ -790,6 +880,26 @@
       </w:pPr>
       <w:r>
         <w:t>Delivered high-quality software under tight deadlines, focusing on minimizing resource usage.</w:t>
+      </w:r>
+    </w:p>
+    <w:p>
+      <w:pPr>
+        <w:spacing w:before="40" w:after="0"/>
+      </w:pPr>
+      <w:r>
+        <w:rPr>
+          <w:b/>
+          <w:color w:val="666666"/>
+          <w:sz w:val="18"/>
+        </w:rPr>
+        <w:t xml:space="preserve">Skills: </w:t>
+      </w:r>
+      <w:r>
+        <w:rPr>
+          <w:color w:val="666666"/>
+          <w:sz w:val="18"/>
+        </w:rPr>
+        <w:t>C · Embedded software · Memory optimization · Linux · Unix · BSD · Expat · Mentoring</w:t>
       </w:r>
     </w:p>
     <w:p>
@@ -894,6 +1004,26 @@
     </w:p>
     <w:p>
       <w:pPr>
+        <w:spacing w:before="40" w:after="0"/>
+      </w:pPr>
+      <w:r>
+        <w:rPr>
+          <w:b/>
+          <w:color w:val="666666"/>
+          <w:sz w:val="18"/>
+        </w:rPr>
+        <w:t xml:space="preserve">Skills: </w:t>
+      </w:r>
+      <w:r>
+        <w:rPr>
+          <w:color w:val="666666"/>
+          <w:sz w:val="18"/>
+        </w:rPr>
+        <w:t>C++ · Qt 3 · Qt 4 · Linux · CRM · OOD · Teaching end users</w:t>
+      </w:r>
+    </w:p>
+    <w:p>
+      <w:pPr>
         <w:spacing w:before="80"/>
       </w:pPr>
     </w:p>
@@ -954,6 +1084,35 @@
       </w:pPr>
       <w:r>
         <w:t>Enabled mobile phone development in a simulated environment using Microsoft Visual Studio.</w:t>
+      </w:r>
+    </w:p>
+    <w:p>
+      <w:pPr>
+        <w:pStyle w:val="ListBullet"/>
+        <w:spacing w:after="40"/>
+      </w:pPr>
+      <w:r>
+        <w:t>Developed a music player database using SQLite on a memory-constrained S30 embedded device, using test-driven development as the player and UI were not yet available.</w:t>
+      </w:r>
+    </w:p>
+    <w:p>
+      <w:pPr>
+        <w:spacing w:before="40" w:after="0"/>
+      </w:pPr>
+      <w:r>
+        <w:rPr>
+          <w:b/>
+          <w:color w:val="666666"/>
+          <w:sz w:val="18"/>
+        </w:rPr>
+        <w:t xml:space="preserve">Skills: </w:t>
+      </w:r>
+      <w:r>
+        <w:rPr>
+          <w:color w:val="666666"/>
+          <w:sz w:val="18"/>
+        </w:rPr>
+        <w:t>C · C++ · Visual Studio · wxWidgets · Qt 3 · Unix · BSD · Simulation · UI development · SQLite · TDD · OOD · WCF · XAML</w:t>
       </w:r>
     </w:p>
     <w:p>
@@ -1035,7 +1194,27 @@
         <w:spacing w:after="40"/>
       </w:pPr>
       <w:r>
-        <w:t>Developed a web service for read outlook mails and calendar on phones</w:t>
+        <w:t>Developed a web service enabling mobile access to Outlook email and calendar via WAP, one of the earliest mobile web integrations.</w:t>
+      </w:r>
+    </w:p>
+    <w:p>
+      <w:pPr>
+        <w:spacing w:before="40" w:after="0"/>
+      </w:pPr>
+      <w:r>
+        <w:rPr>
+          <w:b/>
+          <w:color w:val="666666"/>
+          <w:sz w:val="18"/>
+        </w:rPr>
+        <w:t xml:space="preserve">Skills: </w:t>
+      </w:r>
+      <w:r>
+        <w:rPr>
+          <w:color w:val="666666"/>
+          <w:sz w:val="18"/>
+        </w:rPr>
+        <w:t>Microsoft Visual Basic# (.NET) · REST API · Web Server · WAP</w:t>
       </w:r>
     </w:p>
     <w:p>
@@ -1131,7 +1310,7 @@
         <w:spacing w:after="40"/>
       </w:pPr>
       <w:r>
-        <w:t>Collaborated with a fellow developer to implement concatenated SMS messaging, enhancing user communication.</w:t>
+        <w:t>SMS domain expert with full knowledge of 2G protocols. Collaborated with a fellow developer to implement concatenated SMS messaging.</w:t>
       </w:r>
     </w:p>
     <w:p>
@@ -1141,6 +1320,35 @@
       </w:pPr>
       <w:r>
         <w:t>Integrated T9 input support, improving text input efficiency for users.</w:t>
+      </w:r>
+    </w:p>
+    <w:p>
+      <w:pPr>
+        <w:pStyle w:val="ListBullet"/>
+        <w:spacing w:after="40"/>
+      </w:pPr>
+      <w:r>
+        <w:t>Improved memory management on the S30 platform, optimizing resource usage on constrained hardware.</w:t>
+      </w:r>
+    </w:p>
+    <w:p>
+      <w:pPr>
+        <w:spacing w:before="40" w:after="0"/>
+      </w:pPr>
+      <w:r>
+        <w:rPr>
+          <w:b/>
+          <w:color w:val="666666"/>
+          <w:sz w:val="18"/>
+        </w:rPr>
+        <w:t xml:space="preserve">Skills: </w:t>
+      </w:r>
+      <w:r>
+        <w:rPr>
+          <w:color w:val="666666"/>
+          <w:sz w:val="18"/>
+        </w:rPr>
+        <w:t>C · Unix · BSD · 2G protocols · SMS expert · T9 · UI development · S30 platform · Memory optimization</w:t>
       </w:r>
     </w:p>
     <w:p>
@@ -1213,7 +1421,7 @@
           <w:color w:val="666666"/>
           <w:sz w:val="18"/>
         </w:rPr>
-        <w:t>December 1996 – April 1999 (2 years 5 months)</w:t>
+        <w:t>December 1997 – April 1999 (1 year 5 months)</w:t>
       </w:r>
     </w:p>
     <w:p>
@@ -1232,6 +1440,44 @@
       </w:pPr>
       <w:r>
         <w:t>Built applications that addressed emerging needs and developed a training engine paired with a web interface to streamline user interaction.</w:t>
+      </w:r>
+    </w:p>
+    <w:p>
+      <w:pPr>
+        <w:pStyle w:val="ListBullet"/>
+        <w:spacing w:after="40"/>
+      </w:pPr>
+      <w:r>
+        <w:t>Developed a web browser in Delphi Pascal to render HTML-based training materials.</w:t>
+      </w:r>
+    </w:p>
+    <w:p>
+      <w:pPr>
+        <w:pStyle w:val="ListBullet"/>
+        <w:spacing w:after="40"/>
+      </w:pPr>
+      <w:r>
+        <w:t>Created screensavers using DirectX for 3D rendering.</w:t>
+      </w:r>
+    </w:p>
+    <w:p>
+      <w:pPr>
+        <w:spacing w:before="40" w:after="0"/>
+      </w:pPr>
+      <w:r>
+        <w:rPr>
+          <w:b/>
+          <w:color w:val="666666"/>
+          <w:sz w:val="18"/>
+        </w:rPr>
+        <w:t xml:space="preserve">Skills: </w:t>
+      </w:r>
+      <w:r>
+        <w:rPr>
+          <w:color w:val="666666"/>
+          <w:sz w:val="18"/>
+        </w:rPr>
+        <w:t>Delphi Pascal · OOD · Windows · Windows COM+ · DirectX · Assembler x86 · Web development</w:t>
       </w:r>
     </w:p>
     <w:p>
@@ -1263,7 +1509,7 @@
           <w:color w:val="666666"/>
           <w:sz w:val="18"/>
         </w:rPr>
-        <w:t>January 1993 – October 1996 (3 years 10 months)</w:t>
+        <w:t>January 1993 – October 1997 (4 years 10 months)</w:t>
       </w:r>
     </w:p>
     <w:p>
@@ -1273,6 +1519,42 @@
       </w:pPr>
       <w:r>
         <w:t>Set up new networks to enhance connectivity and efficiency within the organization.</w:t>
+      </w:r>
+    </w:p>
+    <w:p>
+      <w:pPr>
+        <w:pStyle w:val="ListBullet"/>
+        <w:spacing w:after="0"/>
+      </w:pPr>
+      <w:r>
+        <w:t>Led network evolution:</w:t>
+      </w:r>
+    </w:p>
+    <w:p>
+      <w:pPr>
+        <w:pStyle w:val="ListBullet2"/>
+        <w:spacing w:after="0"/>
+      </w:pPr>
+      <w:r>
+        <w:t>1 Mbit coaxial LAN</w:t>
+      </w:r>
+    </w:p>
+    <w:p>
+      <w:pPr>
+        <w:pStyle w:val="ListBullet2"/>
+        <w:spacing w:after="0"/>
+      </w:pPr>
+      <w:r>
+        <w:t>10 Mbit (10BASE-T)</w:t>
+      </w:r>
+    </w:p>
+    <w:p>
+      <w:pPr>
+        <w:pStyle w:val="ListBullet2"/>
+        <w:spacing w:after="0"/>
+      </w:pPr>
+      <w:r>
+        <w:t>100 Mbit UTP (100BASE-TX)</w:t>
       </w:r>
     </w:p>
     <w:p>
@@ -1291,6 +1573,62 @@
       </w:pPr>
       <w:r>
         <w:t>Maintained hardware by adding and replacing components, ensuring optimal performance.</w:t>
+      </w:r>
+    </w:p>
+    <w:p>
+      <w:pPr>
+        <w:pStyle w:val="ListBullet"/>
+        <w:spacing w:after="40"/>
+      </w:pPr>
+      <w:r>
+        <w:t>Built a database system for time registration and contractor management using Microsoft Visual Access.</w:t>
+      </w:r>
+    </w:p>
+    <w:p>
+      <w:pPr>
+        <w:pStyle w:val="ListBullet"/>
+        <w:spacing w:after="40"/>
+      </w:pPr>
+      <w:r>
+        <w:t>Created celebration cards and information posters using CorelDRAW.</w:t>
+      </w:r>
+    </w:p>
+    <w:p>
+      <w:pPr>
+        <w:pStyle w:val="ListBullet"/>
+        <w:spacing w:after="40"/>
+      </w:pPr>
+      <w:r>
+        <w:t>Developed WordPerfect macros to standardize letter templates for Greve Kommune's new visual identity.</w:t>
+      </w:r>
+    </w:p>
+    <w:p>
+      <w:pPr>
+        <w:pStyle w:val="ListBullet"/>
+        <w:spacing w:after="40"/>
+      </w:pPr>
+      <w:r>
+        <w:t>Participated in transition from WordPerfect to Microsoft Office (Word, Excel), including user training and template migration.</w:t>
+      </w:r>
+    </w:p>
+    <w:p>
+      <w:pPr>
+        <w:spacing w:before="40" w:after="0"/>
+      </w:pPr>
+      <w:r>
+        <w:rPr>
+          <w:b/>
+          <w:color w:val="666666"/>
+          <w:sz w:val="18"/>
+        </w:rPr>
+        <w:t xml:space="preserve">Skills: </w:t>
+      </w:r>
+      <w:r>
+        <w:rPr>
+          <w:color w:val="666666"/>
+          <w:sz w:val="18"/>
+        </w:rPr>
+        <w:t>Ethernet Protocol · Coaxial LAN (1 Mbit) · 10BASE-T · 100BASE-TX UTP · TCP/IP · Managed networking · Hardware · WordPerfect · Microsoft Office · Microsoft Visual Access · Database development · CorelDRAW · Teaching</w:t>
       </w:r>
     </w:p>
     <w:p>
@@ -1437,6 +1775,26 @@
       </w:pPr>
       <w:r>
         <w:t>Currently developing Android application for learning purpose and application with Rust and Svelte</w:t>
+      </w:r>
+    </w:p>
+    <w:p>
+      <w:pPr>
+        <w:spacing w:before="40" w:after="0"/>
+      </w:pPr>
+      <w:r>
+        <w:rPr>
+          <w:b/>
+          <w:color w:val="666666"/>
+          <w:sz w:val="18"/>
+        </w:rPr>
+        <w:t xml:space="preserve">Skills: </w:t>
+      </w:r>
+      <w:r>
+        <w:rPr>
+          <w:color w:val="666666"/>
+          <w:sz w:val="18"/>
+        </w:rPr>
+        <w:t>C-64 · Amiga · Assembler 6502/68000 · C++ · C# · Python · Rust · Svelte · Android · GitHub · Azure · AWS · Web API · OOD</w:t>
       </w:r>
     </w:p>
     <w:p>

</xml_diff>

<commit_message>
Refine summary, fix page break for first experience entry
- Update summary: add Qt/QML, security hardening, tooling highlights
- Replace closing line with softer, security-focused statement
- Soften opening tagline tone
- Fix empty page caused by large_entry page break on first entry
</commit_message>
<xml_diff>
--- a/Karsten Opdal - CV.docx
+++ b/Karsten Opdal - CV.docx
@@ -297,6 +297,7 @@
     <w:p>
       <w:pPr>
         <w:pStyle w:val="Heading1"/>
+        <w:keepNext/>
       </w:pPr>
       <w:r>
         <w:rPr>
@@ -307,13 +308,13 @@
     </w:p>
     <w:p>
       <w:r>
-        <w:t>An embedded Linux specialist who makes hardware do what it's told — where failure isn't an option.</w:t>
+        <w:t>An embedded Linux specialist bringing embedded platforms to life — reliably and securely.</w:t>
         <w:br/>
         <w:br/>
-        <w:t>30+ years spanning Nokia handsets, Infineon baseband platforms, and medical simulation devices. He owns the full stack from silicon to screen: Yocto build systems, kernel bring-up, real-time C++ services, CI/CD pipelines, and secure OTA deployment. AI is deeply integrated into his engineering workflow.</w:t>
+        <w:t>30+ years spanning Nokia handsets, Infineon baseband platforms, and medical simulation devices. He owns the full stack from silicon to screen: Yocto build systems, kernel bring-up, real-time C++ services, Qt/QML interfaces, CI/CD pipelines, secure OTA deployment, and security hardening (secure boot, RED, FIPS 140). Builds his own tools — from AI-powered crash analyzers to HSM-backed certificate portals. AI is deeply integrated into his engineering workflow.</w:t>
         <w:br/>
         <w:br/>
-        <w:t>Now looking for the next platform worth building.</w:t>
+        <w:t>Ready to help design and architect the next embedded system, where security is the foundation.</w:t>
         <w:br/>
         <w:br/>
         <w:t>Copenhagen, Denmark | Open to remote across Europe</w:t>
@@ -322,6 +323,7 @@
     <w:p>
       <w:pPr>
         <w:pStyle w:val="Heading1"/>
+        <w:keepNext/>
       </w:pPr>
       <w:r>
         <w:rPr>
@@ -338,6 +340,7 @@
     <w:p>
       <w:pPr>
         <w:pStyle w:val="Heading1"/>
+        <w:keepNext/>
       </w:pPr>
       <w:r>
         <w:rPr>
@@ -417,13 +420,10 @@
       </w:r>
     </w:p>
     <w:p>
-      <w:r>
-        <w:br w:type="page"/>
-      </w:r>
-    </w:p>
-    <w:p>
       <w:pPr>
         <w:pStyle w:val="Heading1"/>
+        <w:keepNext/>
+        <w:pageBreakBefore/>
       </w:pPr>
       <w:r>
         <w:rPr>
@@ -433,6 +433,9 @@
       </w:r>
     </w:p>
     <w:p>
+      <w:pPr>
+        <w:keepNext/>
+      </w:pPr>
       <w:r>
         <w:rPr>
           <w:b/>
@@ -442,6 +445,9 @@
       </w:r>
     </w:p>
     <w:p>
+      <w:pPr>
+        <w:keepNext/>
+      </w:pPr>
       <w:r>
         <w:rPr>
           <w:i/>
@@ -451,6 +457,9 @@
       </w:r>
     </w:p>
     <w:p>
+      <w:pPr>
+        <w:keepNext/>
+      </w:pPr>
       <w:r>
         <w:rPr>
           <w:color w:val="666666"/>
@@ -579,6 +588,7 @@
     <w:p>
       <w:pPr>
         <w:pStyle w:val="ListBullet"/>
+        <w:keepNext/>
         <w:spacing w:after="40"/>
       </w:pPr>
       <w:r>
@@ -611,11 +621,10 @@
       </w:pPr>
     </w:p>
     <w:p>
-      <w:r>
-        <w:br w:type="page"/>
-      </w:r>
-    </w:p>
-    <w:p>
+      <w:pPr>
+        <w:keepNext/>
+        <w:pageBreakBefore/>
+      </w:pPr>
       <w:r>
         <w:rPr>
           <w:b/>
@@ -625,6 +634,9 @@
       </w:r>
     </w:p>
     <w:p>
+      <w:pPr>
+        <w:keepNext/>
+      </w:pPr>
       <w:r>
         <w:rPr>
           <w:i/>
@@ -634,6 +646,9 @@
       </w:r>
     </w:p>
     <w:p>
+      <w:pPr>
+        <w:keepNext/>
+      </w:pPr>
       <w:r>
         <w:rPr>
           <w:color w:val="666666"/>
@@ -657,6 +672,9 @@
       </w:pPr>
     </w:p>
     <w:p>
+      <w:pPr>
+        <w:keepNext/>
+      </w:pPr>
       <w:r>
         <w:rPr>
           <w:b/>
@@ -666,6 +684,9 @@
       </w:r>
     </w:p>
     <w:p>
+      <w:pPr>
+        <w:keepNext/>
+      </w:pPr>
       <w:r>
         <w:rPr>
           <w:i/>
@@ -675,6 +696,9 @@
       </w:r>
     </w:p>
     <w:p>
+      <w:pPr>
+        <w:keepNext/>
+      </w:pPr>
       <w:r>
         <w:rPr>
           <w:color w:val="666666"/>
@@ -713,6 +737,7 @@
     <w:p>
       <w:pPr>
         <w:pStyle w:val="ListBullet"/>
+        <w:keepNext/>
         <w:spacing w:after="40"/>
       </w:pPr>
       <w:r>
@@ -745,6 +770,9 @@
       </w:pPr>
     </w:p>
     <w:p>
+      <w:pPr>
+        <w:keepNext/>
+      </w:pPr>
       <w:r>
         <w:rPr>
           <w:b/>
@@ -754,6 +782,9 @@
       </w:r>
     </w:p>
     <w:p>
+      <w:pPr>
+        <w:keepNext/>
+      </w:pPr>
       <w:r>
         <w:rPr>
           <w:i/>
@@ -763,6 +794,9 @@
       </w:r>
     </w:p>
     <w:p>
+      <w:pPr>
+        <w:keepNext/>
+      </w:pPr>
       <w:r>
         <w:rPr>
           <w:color w:val="666666"/>
@@ -792,6 +826,7 @@
     <w:p>
       <w:pPr>
         <w:pStyle w:val="ListBullet"/>
+        <w:keepNext/>
         <w:spacing w:after="40"/>
       </w:pPr>
       <w:r>
@@ -824,11 +859,10 @@
       </w:pPr>
     </w:p>
     <w:p>
-      <w:r>
-        <w:br w:type="page"/>
-      </w:r>
-    </w:p>
-    <w:p>
+      <w:pPr>
+        <w:keepNext/>
+        <w:pageBreakBefore/>
+      </w:pPr>
       <w:r>
         <w:rPr>
           <w:b/>
@@ -838,6 +872,9 @@
       </w:r>
     </w:p>
     <w:p>
+      <w:pPr>
+        <w:keepNext/>
+      </w:pPr>
       <w:r>
         <w:rPr>
           <w:i/>
@@ -847,6 +884,9 @@
       </w:r>
     </w:p>
     <w:p>
+      <w:pPr>
+        <w:keepNext/>
+      </w:pPr>
       <w:r>
         <w:rPr>
           <w:color w:val="666666"/>
@@ -876,6 +916,7 @@
     <w:p>
       <w:pPr>
         <w:pStyle w:val="ListBullet"/>
+        <w:keepNext/>
         <w:spacing w:after="40"/>
       </w:pPr>
       <w:r>
@@ -908,6 +949,9 @@
       </w:pPr>
     </w:p>
     <w:p>
+      <w:pPr>
+        <w:keepNext/>
+      </w:pPr>
       <w:r>
         <w:rPr>
           <w:b/>
@@ -917,6 +961,9 @@
       </w:r>
     </w:p>
     <w:p>
+      <w:pPr>
+        <w:keepNext/>
+      </w:pPr>
       <w:r>
         <w:rPr>
           <w:i/>
@@ -926,6 +973,9 @@
       </w:r>
     </w:p>
     <w:p>
+      <w:pPr>
+        <w:keepNext/>
+      </w:pPr>
       <w:r>
         <w:rPr>
           <w:color w:val="666666"/>
@@ -949,6 +999,9 @@
       </w:pPr>
     </w:p>
     <w:p>
+      <w:pPr>
+        <w:keepNext/>
+      </w:pPr>
       <w:r>
         <w:rPr>
           <w:b/>
@@ -958,6 +1011,9 @@
       </w:r>
     </w:p>
     <w:p>
+      <w:pPr>
+        <w:keepNext/>
+      </w:pPr>
       <w:r>
         <w:rPr>
           <w:i/>
@@ -967,6 +1023,9 @@
       </w:r>
     </w:p>
     <w:p>
+      <w:pPr>
+        <w:keepNext/>
+      </w:pPr>
       <w:r>
         <w:rPr>
           <w:color w:val="666666"/>
@@ -996,6 +1055,7 @@
     <w:p>
       <w:pPr>
         <w:pStyle w:val="ListBullet"/>
+        <w:keepNext/>
         <w:spacing w:after="40"/>
       </w:pPr>
       <w:r>
@@ -1028,11 +1088,10 @@
       </w:pPr>
     </w:p>
     <w:p>
-      <w:r>
-        <w:br w:type="page"/>
-      </w:r>
-    </w:p>
-    <w:p>
+      <w:pPr>
+        <w:keepNext/>
+        <w:pageBreakBefore/>
+      </w:pPr>
       <w:r>
         <w:rPr>
           <w:b/>
@@ -1042,6 +1101,9 @@
       </w:r>
     </w:p>
     <w:p>
+      <w:pPr>
+        <w:keepNext/>
+      </w:pPr>
       <w:r>
         <w:rPr>
           <w:i/>
@@ -1051,6 +1113,9 @@
       </w:r>
     </w:p>
     <w:p>
+      <w:pPr>
+        <w:keepNext/>
+      </w:pPr>
       <w:r>
         <w:rPr>
           <w:color w:val="666666"/>
@@ -1089,6 +1154,7 @@
     <w:p>
       <w:pPr>
         <w:pStyle w:val="ListBullet"/>
+        <w:keepNext/>
         <w:spacing w:after="40"/>
       </w:pPr>
       <w:r>
@@ -1121,6 +1187,9 @@
       </w:pPr>
     </w:p>
     <w:p>
+      <w:pPr>
+        <w:keepNext/>
+      </w:pPr>
       <w:r>
         <w:rPr>
           <w:b/>
@@ -1130,6 +1199,9 @@
       </w:r>
     </w:p>
     <w:p>
+      <w:pPr>
+        <w:keepNext/>
+      </w:pPr>
       <w:r>
         <w:rPr>
           <w:i/>
@@ -1139,6 +1211,9 @@
       </w:r>
     </w:p>
     <w:p>
+      <w:pPr>
+        <w:keepNext/>
+      </w:pPr>
       <w:r>
         <w:rPr>
           <w:color w:val="666666"/>
@@ -1162,6 +1237,9 @@
       </w:pPr>
     </w:p>
     <w:p>
+      <w:pPr>
+        <w:keepNext/>
+      </w:pPr>
       <w:r>
         <w:rPr>
           <w:b/>
@@ -1171,6 +1249,9 @@
       </w:r>
     </w:p>
     <w:p>
+      <w:pPr>
+        <w:keepNext/>
+      </w:pPr>
       <w:r>
         <w:rPr>
           <w:i/>
@@ -1180,6 +1261,9 @@
       </w:r>
     </w:p>
     <w:p>
+      <w:pPr>
+        <w:keepNext/>
+      </w:pPr>
       <w:r>
         <w:rPr>
           <w:color w:val="666666"/>
@@ -1191,6 +1275,7 @@
     <w:p>
       <w:pPr>
         <w:pStyle w:val="ListBullet"/>
+        <w:keepNext/>
         <w:spacing w:after="40"/>
       </w:pPr>
       <w:r>
@@ -1223,6 +1308,9 @@
       </w:pPr>
     </w:p>
     <w:p>
+      <w:pPr>
+        <w:keepNext/>
+      </w:pPr>
       <w:r>
         <w:rPr>
           <w:b/>
@@ -1232,6 +1320,9 @@
       </w:r>
     </w:p>
     <w:p>
+      <w:pPr>
+        <w:keepNext/>
+      </w:pPr>
       <w:r>
         <w:rPr>
           <w:i/>
@@ -1241,6 +1332,9 @@
       </w:r>
     </w:p>
     <w:p>
+      <w:pPr>
+        <w:keepNext/>
+      </w:pPr>
       <w:r>
         <w:rPr>
           <w:color w:val="666666"/>
@@ -1264,11 +1358,10 @@
       </w:pPr>
     </w:p>
     <w:p>
-      <w:r>
-        <w:br w:type="page"/>
-      </w:r>
-    </w:p>
-    <w:p>
+      <w:pPr>
+        <w:keepNext/>
+        <w:pageBreakBefore/>
+      </w:pPr>
       <w:r>
         <w:rPr>
           <w:b/>
@@ -1278,6 +1371,9 @@
       </w:r>
     </w:p>
     <w:p>
+      <w:pPr>
+        <w:keepNext/>
+      </w:pPr>
       <w:r>
         <w:rPr>
           <w:i/>
@@ -1287,6 +1383,9 @@
       </w:r>
     </w:p>
     <w:p>
+      <w:pPr>
+        <w:keepNext/>
+      </w:pPr>
       <w:r>
         <w:rPr>
           <w:color w:val="666666"/>
@@ -1325,6 +1424,7 @@
     <w:p>
       <w:pPr>
         <w:pStyle w:val="ListBullet"/>
+        <w:keepNext/>
         <w:spacing w:after="40"/>
       </w:pPr>
       <w:r>
@@ -1357,6 +1457,9 @@
       </w:pPr>
     </w:p>
     <w:p>
+      <w:pPr>
+        <w:keepNext/>
+      </w:pPr>
       <w:r>
         <w:rPr>
           <w:b/>
@@ -1366,6 +1469,9 @@
       </w:r>
     </w:p>
     <w:p>
+      <w:pPr>
+        <w:keepNext/>
+      </w:pPr>
       <w:r>
         <w:rPr>
           <w:i/>
@@ -1375,6 +1481,9 @@
       </w:r>
     </w:p>
     <w:p>
+      <w:pPr>
+        <w:keepNext/>
+      </w:pPr>
       <w:r>
         <w:rPr>
           <w:color w:val="666666"/>
@@ -1398,6 +1507,9 @@
       </w:pPr>
     </w:p>
     <w:p>
+      <w:pPr>
+        <w:keepNext/>
+      </w:pPr>
       <w:r>
         <w:rPr>
           <w:b/>
@@ -1407,6 +1519,9 @@
       </w:r>
     </w:p>
     <w:p>
+      <w:pPr>
+        <w:keepNext/>
+      </w:pPr>
       <w:r>
         <w:rPr>
           <w:i/>
@@ -1416,6 +1531,9 @@
       </w:r>
     </w:p>
     <w:p>
+      <w:pPr>
+        <w:keepNext/>
+      </w:pPr>
       <w:r>
         <w:rPr>
           <w:color w:val="666666"/>
@@ -1454,6 +1572,7 @@
     <w:p>
       <w:pPr>
         <w:pStyle w:val="ListBullet"/>
+        <w:keepNext/>
         <w:spacing w:after="40"/>
       </w:pPr>
       <w:r>
@@ -1486,6 +1605,10 @@
       </w:pPr>
     </w:p>
     <w:p>
+      <w:pPr>
+        <w:keepNext/>
+        <w:pageBreakBefore/>
+      </w:pPr>
       <w:r>
         <w:rPr>
           <w:b/>
@@ -1495,6 +1618,9 @@
       </w:r>
     </w:p>
     <w:p>
+      <w:pPr>
+        <w:keepNext/>
+      </w:pPr>
       <w:r>
         <w:rPr>
           <w:i/>
@@ -1504,6 +1630,9 @@
       </w:r>
     </w:p>
     <w:p>
+      <w:pPr>
+        <w:keepNext/>
+      </w:pPr>
       <w:r>
         <w:rPr>
           <w:color w:val="666666"/>
@@ -1605,6 +1734,7 @@
     <w:p>
       <w:pPr>
         <w:pStyle w:val="ListBullet"/>
+        <w:keepNext/>
         <w:spacing w:after="40"/>
       </w:pPr>
       <w:r>
@@ -1637,11 +1767,10 @@
       </w:pPr>
     </w:p>
     <w:p>
-      <w:r>
-        <w:br w:type="page"/>
-      </w:r>
-    </w:p>
-    <w:p>
+      <w:pPr>
+        <w:keepNext/>
+        <w:pageBreakBefore/>
+      </w:pPr>
       <w:r>
         <w:rPr>
           <w:b/>
@@ -1651,6 +1780,9 @@
       </w:r>
     </w:p>
     <w:p>
+      <w:pPr>
+        <w:keepNext/>
+      </w:pPr>
       <w:r>
         <w:rPr>
           <w:i/>
@@ -1660,6 +1792,9 @@
       </w:r>
     </w:p>
     <w:p>
+      <w:pPr>
+        <w:keepNext/>
+      </w:pPr>
       <w:r>
         <w:rPr>
           <w:color w:val="666666"/>
@@ -1683,6 +1818,9 @@
       </w:pPr>
     </w:p>
     <w:p>
+      <w:pPr>
+        <w:keepNext/>
+      </w:pPr>
       <w:r>
         <w:rPr>
           <w:b/>
@@ -1692,6 +1830,9 @@
       </w:r>
     </w:p>
     <w:p>
+      <w:pPr>
+        <w:keepNext/>
+      </w:pPr>
       <w:r>
         <w:rPr>
           <w:i/>
@@ -1701,6 +1842,9 @@
       </w:r>
     </w:p>
     <w:p>
+      <w:pPr>
+        <w:keepNext/>
+      </w:pPr>
       <w:r>
         <w:rPr>
           <w:color w:val="666666"/>
@@ -1724,6 +1868,9 @@
       </w:pPr>
     </w:p>
     <w:p>
+      <w:pPr>
+        <w:keepNext/>
+      </w:pPr>
       <w:r>
         <w:rPr>
           <w:b/>
@@ -1733,6 +1880,9 @@
       </w:r>
     </w:p>
     <w:p>
+      <w:pPr>
+        <w:keepNext/>
+      </w:pPr>
       <w:r>
         <w:rPr>
           <w:i/>
@@ -1742,6 +1892,9 @@
       </w:r>
     </w:p>
     <w:p>
+      <w:pPr>
+        <w:keepNext/>
+      </w:pPr>
       <w:r>
         <w:rPr>
           <w:color w:val="666666"/>
@@ -1771,6 +1924,7 @@
     <w:p>
       <w:pPr>
         <w:pStyle w:val="ListBullet"/>
+        <w:keepNext/>
         <w:spacing w:after="40"/>
       </w:pPr>
       <w:r>
@@ -1803,6 +1957,9 @@
       </w:pPr>
     </w:p>
     <w:p>
+      <w:pPr>
+        <w:keepNext/>
+      </w:pPr>
       <w:r>
         <w:rPr>
           <w:b/>
@@ -1812,6 +1969,9 @@
       </w:r>
     </w:p>
     <w:p>
+      <w:pPr>
+        <w:keepNext/>
+      </w:pPr>
       <w:r>
         <w:rPr>
           <w:i/>
@@ -1821,6 +1981,9 @@
       </w:r>
     </w:p>
     <w:p>
+      <w:pPr>
+        <w:keepNext/>
+      </w:pPr>
       <w:r>
         <w:rPr>
           <w:color w:val="666666"/>
@@ -1853,13 +2016,10 @@
       </w:pPr>
     </w:p>
     <w:p>
-      <w:r>
-        <w:br w:type="page"/>
-      </w:r>
-    </w:p>
-    <w:p>
       <w:pPr>
         <w:pStyle w:val="Heading1"/>
+        <w:keepNext/>
+        <w:pageBreakBefore/>
       </w:pPr>
       <w:r>
         <w:rPr>
@@ -1870,6 +2030,7 @@
     </w:p>
     <w:p>
       <w:pPr>
+        <w:keepNext/>
         <w:spacing w:before="0" w:after="0"/>
       </w:pPr>
       <w:r>
@@ -1878,6 +2039,7 @@
     </w:p>
     <w:p>
       <w:pPr>
+        <w:keepNext/>
         <w:spacing w:before="0" w:after="0"/>
       </w:pPr>
       <w:r>
@@ -1886,6 +2048,7 @@
     </w:p>
     <w:p>
       <w:pPr>
+        <w:keepNext/>
         <w:spacing w:before="0" w:after="0"/>
       </w:pPr>
       <w:r>
@@ -1894,6 +2057,7 @@
     </w:p>
     <w:p>
       <w:pPr>
+        <w:keepNext/>
         <w:spacing w:before="0" w:after="0"/>
       </w:pPr>
       <w:r>
@@ -1902,6 +2066,7 @@
     </w:p>
     <w:p>
       <w:pPr>
+        <w:keepNext/>
         <w:spacing w:before="0" w:after="0"/>
       </w:pPr>
       <w:r>
@@ -1911,6 +2076,7 @@
     <w:p>
       <w:pPr>
         <w:pStyle w:val="Heading1"/>
+        <w:keepNext/>
       </w:pPr>
       <w:r>
         <w:rPr>
@@ -1993,7 +2159,7 @@
     </w:p>
     <w:sectPr>
       <w:pgSz w:w="12240" w:h="15840"/>
-      <w:pgMar w:top="1440" w:right="1800" w:bottom="1440" w:left="1800" w:header="720" w:footer="720" w:gutter="0"/>
+      <w:pgMar w:top="720" w:right="1800" w:bottom="1440" w:left="1800" w:header="720" w:footer="720" w:gutter="0"/>
       <w:cols w:space="720"/>
       <w:docGrid w:linePitch="360"/>
     </w:sectPr>

</xml_diff>